<commit_message>
Add mock guidance when source feedback is missing
</commit_message>
<xml_diff>
--- a/mod/scorm/studytopic/samples/Real_Formula_Modifications_Mock_10_Book_Preview.docx
+++ b/mod/scorm/studytopic/samples/Real_Formula_Modifications_Mock_10_Book_Preview.docx
@@ -436,7 +436,7 @@
         <w:rPr>
           <w:color w:val="245B38"/>
         </w:rPr>
-        <w:t xml:space="preserve">For severe irritability and difficult sleep, the keyed modification is Add Hu po (Succinum), Suan zao ren (Sm Zizyphi spinosae), Ye jiao teng (Caulis Polygoni multiflori). This is the symptom-specific change tested by the question.</w:t>
+        <w:t xml:space="preserve">For severe irritability and difficult sleep, the source bank keys Add Hu po (Succinum), Suan zao ren (Sm Zizyphi spinosae), Ye jiao teng (Caulis Polygoni multiflori) as the correct answer. The formula-and-pattern review above is the rationale stored with this question.</w:t>
       </w:r>
     </w:p>
     <w:p>
@@ -475,7 +475,7 @@
         <w:rPr>
           <w:color w:val="6B3030"/>
         </w:rPr>
-        <w:t xml:space="preserve">The source bank does not key this option for severe irritability and difficult sleep. It represents a different formula-modification distinction, so match the symptom asked in the stem to its specific modification.</w:t>
+        <w:t xml:space="preserve">The source bank does not key this option as correct for severe irritability and difficult sleep. It represents a different answer distinction; compare the specific pattern, symptom, ingredients, or analysis requested in the stem.</w:t>
       </w:r>
     </w:p>
     <w:p>
@@ -501,7 +501,7 @@
         <w:rPr>
           <w:color w:val="6B3030"/>
         </w:rPr>
-        <w:t xml:space="preserve">The source bank does not key this option for severe irritability and difficult sleep. It represents a different formula-modification distinction, so match the symptom asked in the stem to its specific modification.</w:t>
+        <w:t xml:space="preserve">The source bank does not key this option as correct for severe irritability and difficult sleep. It represents a different answer distinction; compare the specific pattern, symptom, ingredients, or analysis requested in the stem.</w:t>
       </w:r>
     </w:p>
     <w:p>
@@ -527,7 +527,7 @@
         <w:rPr>
           <w:color w:val="6B3030"/>
         </w:rPr>
-        <w:t xml:space="preserve">The source bank does not key this option for severe irritability and difficult sleep. It represents a different formula-modification distinction, so match the symptom asked in the stem to its specific modification.</w:t>
+        <w:t xml:space="preserve">The source bank does not key this option as correct for severe irritability and difficult sleep. It represents a different answer distinction; compare the specific pattern, symptom, ingredients, or analysis requested in the stem.</w:t>
       </w:r>
     </w:p>
     <w:p>
@@ -832,7 +832,7 @@
         <w:rPr>
           <w:color w:val="245B38"/>
         </w:rPr>
-        <w:t xml:space="preserve">For seizures, the keyed modification is Increase the dosage of Chai Hu (Rx bupleuri) and add a large dose of Dan shen (Rx Salviae militiorrhizae). This is the symptom-specific change tested by the question.</w:t>
+        <w:t xml:space="preserve">For seizures, the source bank keys Increase the dosage of Chai Hu (Rx bupleuri) and add a large dose of Dan shen (Rx Salviae militiorrhizae) as the correct answer. The formula-and-pattern review above is the rationale stored with this question.</w:t>
       </w:r>
     </w:p>
     <w:p>
@@ -871,7 +871,7 @@
         <w:rPr>
           <w:color w:val="6B3030"/>
         </w:rPr>
-        <w:t xml:space="preserve">The source bank does not key this option for seizures. It represents a different formula-modification distinction, so match the symptom asked in the stem to its specific modification.</w:t>
+        <w:t xml:space="preserve">The source bank does not key this option as correct for seizures. It represents a different answer distinction; compare the specific pattern, symptom, ingredients, or analysis requested in the stem.</w:t>
       </w:r>
     </w:p>
     <w:p>
@@ -897,7 +897,7 @@
         <w:rPr>
           <w:color w:val="6B3030"/>
         </w:rPr>
-        <w:t xml:space="preserve">The source bank does not key this option for seizures. It represents a different formula-modification distinction, so match the symptom asked in the stem to its specific modification.</w:t>
+        <w:t xml:space="preserve">The source bank does not key this option as correct for seizures. It represents a different answer distinction; compare the specific pattern, symptom, ingredients, or analysis requested in the stem.</w:t>
       </w:r>
     </w:p>
     <w:p>
@@ -1206,7 +1206,7 @@
         <w:rPr>
           <w:color w:val="245B38"/>
         </w:rPr>
-        <w:t xml:space="preserve">For the modification described in the question, the keyed modification is Black Rambling Powder (hei xiao yao san). This is the symptom-specific change tested by the question.</w:t>
+        <w:t xml:space="preserve">For the question prompt, the source bank keys Black Rambling Powder (hei xiao yao san) as the correct answer. The formula-and-pattern review above is the rationale stored with this question.</w:t>
       </w:r>
     </w:p>
     <w:p>
@@ -1245,7 +1245,7 @@
         <w:rPr>
           <w:color w:val="6B3030"/>
         </w:rPr>
-        <w:t xml:space="preserve">The source bank does not key this option for the modification described in the question. It represents a different formula-modification distinction, so match the symptom asked in the stem to its specific modification.</w:t>
+        <w:t xml:space="preserve">The source bank does not key this option as correct for the question prompt. It represents a different answer distinction; compare the specific pattern, symptom, ingredients, or analysis requested in the stem.</w:t>
       </w:r>
     </w:p>
     <w:p>
@@ -1271,7 +1271,7 @@
         <w:rPr>
           <w:color w:val="6B3030"/>
         </w:rPr>
-        <w:t xml:space="preserve">The source bank does not key this option for the modification described in the question. It represents a different formula-modification distinction, so match the symptom asked in the stem to its specific modification.</w:t>
+        <w:t xml:space="preserve">The source bank does not key this option as correct for the question prompt. It represents a different answer distinction; compare the specific pattern, symptom, ingredients, or analysis requested in the stem.</w:t>
       </w:r>
     </w:p>
     <w:p>
@@ -1297,7 +1297,7 @@
         <w:rPr>
           <w:color w:val="6B3030"/>
         </w:rPr>
-        <w:t xml:space="preserve">The source bank does not key this option for the modification described in the question. It represents a different formula-modification distinction, so match the symptom asked in the stem to its specific modification.</w:t>
+        <w:t xml:space="preserve">The source bank does not key this option as correct for the question prompt. It represents a different answer distinction; compare the specific pattern, symptom, ingredients, or analysis requested in the stem.</w:t>
       </w:r>
     </w:p>
     <w:p>
@@ -1593,7 +1593,7 @@
         <w:rPr>
           <w:color w:val="245B38"/>
         </w:rPr>
-        <w:t xml:space="preserve">For cough, the keyed modification is Add Wu wei zi (Schisandrae fructus) and Gan jiang (Rz zingiberis). This is the symptom-specific change tested by the question.</w:t>
+        <w:t xml:space="preserve">For cough, the source bank keys Add Wu wei zi (Schisandrae fructus) and Gan jiang (Rz zingiberis) as the correct answer. The formula-and-pattern review above is the rationale stored with this question.</w:t>
       </w:r>
     </w:p>
     <w:p>
@@ -1980,7 +1980,7 @@
         <w:rPr>
           <w:color w:val="245B38"/>
         </w:rPr>
-        <w:t xml:space="preserve">For palpitation, the keyed modification is Add Gui zhi (Rm Cinnamomi). This is the symptom-specific change tested by the question.</w:t>
+        <w:t xml:space="preserve">For palpitation, the source bank keys Add Gui zhi (Rm Cinnamomi) as the correct answer. The formula-and-pattern review above is the rationale stored with this question.</w:t>
       </w:r>
     </w:p>
     <w:p>
@@ -2367,7 +2367,7 @@
         <w:rPr>
           <w:color w:val="245B38"/>
         </w:rPr>
-        <w:t xml:space="preserve">For abdominal pain, the keyed modification is Add Zhi fu zi (Rx Aconiti lateralis preparata). This is the symptom-specific change tested by the question.</w:t>
+        <w:t xml:space="preserve">For abdominal pain, the source bank keys Add Zhi fu zi (Rx Aconiti lateralis preparata) as the correct answer. The formula-and-pattern review above is the rationale stored with this question.</w:t>
       </w:r>
     </w:p>
     <w:p>
@@ -2754,7 +2754,7 @@
         <w:rPr>
           <w:color w:val="245B38"/>
         </w:rPr>
-        <w:t xml:space="preserve">For epigastric pain with acid reflux, the keyed modification is Add Left Metal Pill (zuo jin wan). This is the symptom-specific change tested by the question.</w:t>
+        <w:t xml:space="preserve">For epigastric pain with acid reflux, the source bank keys Add Left Metal Pill (zuo jin wan) as the correct answer. The formula-and-pattern review above is the rationale stored with this question.</w:t>
       </w:r>
     </w:p>
     <w:p>
@@ -3157,7 +3157,7 @@
         <w:rPr>
           <w:color w:val="245B38"/>
         </w:rPr>
-        <w:t xml:space="preserve">For blood deficiency with hypochondriac pain and irregular menstruation, the keyed modification is Remove Zhi shi (Fr Aurantii immaturus)</w:t>
+        <w:t xml:space="preserve">For blood deficiency with hypochondriac pain and irregular menstruation, the source bank keys Remove Zhi shi (Fr Aurantii immaturus)</w:t>
       </w:r>
       <w:r>
         <w:br/>
@@ -3166,7 +3166,7 @@
         <w:rPr>
           <w:color w:val="245B38"/>
         </w:rPr>
-        <w:t xml:space="preserve">Add Bai zhu (Rz Atractylodis macrocephalae), Fu ling (Poria), Dang gui (Rx Angelicae sinensis). This is the symptom-specific change tested by the question.</w:t>
+        <w:t xml:space="preserve">Add Bai zhu (Rz Atractylodis macrocephalae), Fu ling (Poria), Dang gui (Rx Angelicae sinensis) as the correct answer. The formula-and-pattern review above is the rationale stored with this question.</w:t>
       </w:r>
     </w:p>
     <w:p>
@@ -3257,7 +3257,7 @@
         <w:rPr>
           <w:color w:val="6B3030"/>
         </w:rPr>
-        <w:t xml:space="preserve">The source bank does not key this option for blood deficiency with hypochondriac pain and irregular menstruation. It represents a different formula-modification distinction, so match the symptom asked in the stem to its specific modification.</w:t>
+        <w:t xml:space="preserve">The source bank does not key this option as correct for blood deficiency with hypochondriac pain and irregular menstruation. It represents a different answer distinction; compare the specific pattern, symptom, ingredients, or analysis requested in the stem.</w:t>
       </w:r>
     </w:p>
     <w:p>
@@ -3559,7 +3559,7 @@
         <w:rPr>
           <w:color w:val="245B38"/>
         </w:rPr>
-        <w:t xml:space="preserve">For food stagnation with abdominal pain, the keyed modification is Add Shan za (Fructus Crataegi), Mai ya (Fr Hordei germinatus), Ji nei jin (Endothelium corneum gigeriae galli). This is the symptom-specific change tested by the question.</w:t>
+        <w:t xml:space="preserve">For food stagnation with abdominal pain, the source bank keys Add Shan za (Fructus Crataegi), Mai ya (Fr Hordei germinatus), Ji nei jin (Endothelium corneum gigeriae galli) as the correct answer. The formula-and-pattern review above is the rationale stored with this question.</w:t>
       </w:r>
     </w:p>
     <w:p>
@@ -3659,7 +3659,7 @@
         <w:rPr>
           <w:color w:val="6B3030"/>
         </w:rPr>
-        <w:t xml:space="preserve">The source bank does not key this option for food stagnation with abdominal pain. It represents a different formula-modification distinction, so match the symptom asked in the stem to its specific modification.</w:t>
+        <w:t xml:space="preserve">The source bank does not key this option as correct for food stagnation with abdominal pain. It represents a different answer distinction; compare the specific pattern, symptom, ingredients, or analysis requested in the stem.</w:t>
       </w:r>
     </w:p>
     <w:p>
@@ -3961,7 +3961,7 @@
         <w:rPr>
           <w:color w:val="245B38"/>
         </w:rPr>
-        <w:t xml:space="preserve">For painful menstruation, the keyed modification is Add Dang gui (Rx Angelicae sinensis), Wu yao (Rx Linderae), Xiang fu (Rz Cyperi), Yan hu suo (Rz Corydalis). This is the symptom-specific change tested by the question.</w:t>
+        <w:t xml:space="preserve">For painful menstruation, the source bank keys Add Dang gui (Rx Angelicae sinensis), Wu yao (Rx Linderae), Xiang fu (Rz Cyperi), Yan hu suo (Rz Corydalis) as the correct answer. The formula-and-pattern review above is the rationale stored with this question.</w:t>
       </w:r>
     </w:p>
     <w:p>
@@ -4061,7 +4061,7 @@
         <w:rPr>
           <w:color w:val="6B3030"/>
         </w:rPr>
-        <w:t xml:space="preserve">The source bank does not key this option for painful menstruation. It represents a different formula-modification distinction, so match the symptom asked in the stem to its specific modification.</w:t>
+        <w:t xml:space="preserve">The source bank does not key this option as correct for painful menstruation. It represents a different answer distinction; compare the specific pattern, symptom, ingredients, or analysis requested in the stem.</w:t>
       </w:r>
     </w:p>
     <w:p>

</xml_diff>